<commit_message>
Rewrite editor report in a natural reviewer voice
Co-Authored-By: Claude Opus 4.8 (1M context) <noreply@anthropic.com>
Claude-Session: https://claude.ai/code/session_01Jq5twRGHDHs2ZEsXt1AWJQ
</commit_message>
<xml_diff>
--- a/Editor_Report_260758082.docx
+++ b/Editor_Report_260758082.docx
@@ -4,15 +4,14 @@
   <w:body>
     <w:p>
       <w:pPr>
-        <w:spacing w:before="0" w:after="120"/>
+        <w:spacing w:after="120"/>
       </w:pPr>
       <w:r>
         <w:rPr>
           <w:b/>
-          <w:color w:val="000000"/>
-          <w:sz w:val="30"/>
+          <w:sz w:val="28"/>
         </w:rPr>
-        <w:t>Confidential Comments to the Editor</w:t>
+        <w:t>Comments to the Editor</w:t>
       </w:r>
     </w:p>
     <w:p>
@@ -71,77 +70,79 @@
     </w:p>
     <w:p>
       <w:pPr>
-        <w:spacing w:after="80"/>
+        <w:spacing w:after="40"/>
+      </w:pPr>
+    </w:p>
+    <w:p>
+      <w:pPr>
+        <w:spacing w:after="160"/>
+        <w:jc w:val="both"/>
       </w:pPr>
       <w:r>
-        <w:rPr>
-          <w:color w:val="AAAAAA"/>
-          <w:sz w:val="16"/>
-        </w:rPr>
-        <w:t>——————————————————————————————————————————————————</w:t>
+        <w:t>This is a worthwhile paper, and I would like to see it published eventually. The authors set out to measure and map informal urban development across the whole Buenos Aires metropolitan area from census data, rather than looking only inside the usual pre-defined “informal settlements.” That ambition is the main reason I am recommending revision rather than rejection: there is very little quantitative work of this kind, the dataset (close to 15,000 census tracts) is a real asset, and the “interbreeding” model the authors propose is worth developing. The paper is not ready, though, and one of the problems reaches the heart of its main conclusion.</w:t>
       </w:r>
     </w:p>
     <w:p>
       <w:pPr>
-        <w:spacing w:after="120"/>
+        <w:spacing w:after="160"/>
         <w:jc w:val="both"/>
       </w:pPr>
       <w:r>
-        <w:t>This manuscript tackles an important and genuinely under-served problem: large-scale, census-based quantification and mapping of informal urban development (IUD) across an entire metropolitan area, rather than within pre-defined “informal settlements.” The full-coverage approach to the Buenos Aires Metropolitan Area (14,879 census tracts), the use of PCA to characterise material assemblages, and the proposed “interbreeding” conceptual model are original and potentially valuable. The topic fits the journal well and, if the issues below are addressed, the paper could make a solid contribution. I therefore recommend major revision rather than rejection.</w:t>
+        <w:t>One caveat about my reading. I could go through the text, the references and Table 1, but Tables 2–5 and the figures reached me only as images, so I was not able to check the actual factor loadings. My comments on the numbers should be read with that limitation in mind.</w:t>
       </w:r>
     </w:p>
     <w:p>
       <w:pPr>
-        <w:spacing w:after="120"/>
+        <w:spacing w:after="160"/>
         <w:jc w:val="both"/>
       </w:pPr>
       <w:r>
-        <w:t>My assessment rests on the text, references, and Table 1, which were fully legible; the numeric content of Tables 2–5 and Figures 1–8 came as images and could not be verified, so the quantitative claims should be checked against the actual tables.</w:t>
-      </w:r>
-    </w:p>
-    <w:p>
-      <w:pPr>
-        <w:spacing w:after="120"/>
-        <w:jc w:val="both"/>
-      </w:pPr>
-      <w:r>
-        <w:t xml:space="preserve">There is one issue I consider decisive for the validity of the central findings. </w:t>
+        <w:t xml:space="preserve">My main concern is how informality is measured. </w:t>
       </w:r>
       <w:r>
         <w:rPr>
           <w:b/>
         </w:rPr>
-        <w:t>The infrastructure variables conflate “lack of connection to a public network” with “informality.”</w:t>
+        <w:t>Several of the “informal” attributes in Table 1 are really indicators of not being connected to a public network</w:t>
       </w:r>
       <w:r>
-        <w:t xml:space="preserve"> Several attributes coded as informal — water from a pump or well, sewage via septic tank/cesspit, cooking with bottled or bulk gas — are, in the Buenos Aires periphery, widespread in formal, legally tenured, well-built neighbourhoods, where networks were simply never extended (a supply-side public-investment deficit, and in the case of septic tanks a code-compliant standard solution). This matters because it may mechanically generate the paper’s headline result that “IUD is dispersed across the whole metropolitan area and not confined to pockets”: that dispersion could largely reflect the well-known network-coverage gradient (serviced core, under-serviced periphery) rather than the diffusion of informality. The authors partly anticipate this with a standards-based definition (§4.1), but that does not separate genuine material deprivation from mere network non-extension, and it risks reducing “IUD” to “service deficit,” which would render the “not confined” claim near-tautological. I have asked them to separate precariousness from non-connection, run a sensitivity analysis excluding the non-precarious network attributes, and report whether hybridity and dispersion survive.</w:t>
+        <w:t>: water from a pump or a well, sewage to a septic tank or cesspit, cooking with bottled or bulk gas. In the Buenos Aires conurbano these are everywhere, including in perfectly formal, legally owned, well-built neighbourhoods that the networks never reached. A septic tank is the normal, code-compliant solution across much of the periphery, and bottled gas is simply what people use where there is no gas grid. So what the variables largely capture is a deficit in network coverage, a failure of public investment, rather than informality in any usual sense.</w:t>
       </w:r>
     </w:p>
     <w:p>
       <w:pPr>
-        <w:spacing w:after="120"/>
+        <w:spacing w:after="160"/>
         <w:jc w:val="both"/>
       </w:pPr>
       <w:r>
-        <w:t>Four further substantive points should be resolved: (i) the PCA appears to use household counts rather than within-tract proportions, raising a possible tract-size artefact (please also report variance explained); (ii) the paper infers the absence of a temporal progressive sequence from a single cross-sectional census, which is not logically warranted and should be tempered; (iii) “cluster analysis” appears in the keywords but no clustering is performed, while the text repeatedly speaks of “IUD types” that are in fact continuous components; and (iv) there is no external validation against official settlement inventories (e.g., RENABAP), which would directly substantiate the settlement-paradox argument and help separate true informality from service deficit. The spatial analysis also needs full specification (weights matrix, multiple-comparison correction), and the data are from 2010 while a 2022 census now exists.</w:t>
+        <w:t>This is not a side issue, because it may be producing the paper’s central result. The authors conclude that informal development is spread across the whole metropolitan area and is not confined to “pockets.” But if you build informality partly out of the absence of networks, you will find it everywhere, simply because the periphery is poorly serviced, formal and informal alike. The dispersion they report may be the familiar coverage gradient, a well-serviced core and an under-serviced edge, rather than the spread of informality. They do raise this in §4.1, arguing that in a city piped water is “expected,” so a well counts as informal. That is a defensible position, but it does not separate genuine material hardship (a dirt floor, a cardboard roof, an open ditch for sewage, water carried in from outside the plot) from a formal house that simply is not on the grid. And once informality comes to mean “lacks services,” the claim that it is not confined to pockets becomes almost true by definition. I have asked the authors to separate precariousness from non-connection and to re-run the analysis without the non-precarious network categories, to see whether the hybridity and dispersion findings hold up.</w:t>
       </w:r>
     </w:p>
     <w:p>
       <w:pPr>
-        <w:spacing w:after="120"/>
+        <w:spacing w:after="160"/>
         <w:jc w:val="both"/>
       </w:pPr>
       <w:r>
-        <w:t>Finally, the manuscript needs careful language and reference editing: recurrent grammatical calques and omitted subjects, an occasionally colloquial register, a corrupted INDEC reference and a malformed Castells &amp; Portes entry, inconsistent citation styles, and keyword/voice/anonymity inconsistencies (a collaborator is named in the acknowledgements of a double-blind submission).</w:t>
+        <w:t>A few other things need work. The PCA appears to be run on counts of households rather than shares within each tract, which can make the leading components pick up tract size more than anything else; the authors should justify this or move to proportions, and report how much variance each component explains. The argument that development does not follow a progressive, stage-by-stage path rests on a single census, but that is a cross-section, and one snapshot cannot really rule out a process that unfolds over time, so the claim should be softened. “Cluster analysis” is listed in the keywords and the text keeps referring to “types,” yet no clustering is actually carried out; they should either add it or drop the language. There is also no comparison against an external source on where settlements actually are, when RENABAP would be the obvious choice. That is a missed opportunity, since such a comparison would do precisely what the paper wants, namely show informality appearing outside the registered settlements. Beyond this, the spatial analysis is under-specified (no weights matrix, no correction for multiple testing), and the data are from 2010 although a 2022 census now exists.</w:t>
       </w:r>
     </w:p>
     <w:p>
       <w:pPr>
-        <w:spacing w:after="120"/>
+        <w:spacing w:after="160"/>
         <w:jc w:val="both"/>
       </w:pPr>
       <w:r>
-        <w:t>In short: a promising and worthwhile paper built on a strong dataset and an interesting conceptual contribution, but currently undermined by a measurement-validity problem that may be driving its main conclusion, together with several methodological and inferential gaps. These are addressable, and I would be willing to review a revised version.</w:t>
+        <w:t>The writing also needs a careful pass. There are repeated grammatical slips, including dropped subjects and “census tracks” for “tracts,” a few phrasings that are too casual for the journal, mixed citation styles, and at least two broken references (INDEC and Castells &amp; Portes). The keywords differ between the cover and abstract pages, and a collaborator is named in the acknowledgements of what should be a blind submission.</w:t>
+      </w:r>
+    </w:p>
+    <w:p>
+      <w:pPr>
+        <w:spacing w:after="160"/>
+        <w:jc w:val="both"/>
+      </w:pPr>
+      <w:r>
+        <w:t>In sum: good data, a real question, and an interesting model, but the headline finding may be an artefact of the way informality is defined, and that has to be sorted out before I could support publication. I would be glad to look at a revised version.</w:t>
       </w:r>
     </w:p>
     <w:sectPr>
@@ -519,7 +520,7 @@
     <w:rsid w:val="00FC693F"/>
     <w:rPr>
       <w:rFonts w:ascii="Calibri" w:hAnsi="Calibri"/>
-      <w:sz w:val="21"/>
+      <w:sz w:val="22"/>
     </w:rPr>
   </w:style>
   <w:style w:type="paragraph" w:styleId="Header">

</xml_diff>